<commit_message>
Polish report layout and development history section
</commit_message>
<xml_diff>
--- a/docs/Assignment2_Report.docx
+++ b/docs/Assignment2_Report.docx
@@ -93,7 +93,7 @@
             <w:r>
               <w:rPr>
                 <w:rFonts w:ascii="Arial" w:hAnsi="Arial"/>
-                <w:sz w:val="18"/>
+                <w:sz w:val="16"/>
               </w:rPr>
               <w:t>Student</w:t>
             </w:r>
@@ -111,7 +111,7 @@
             <w:r>
               <w:rPr>
                 <w:rFonts w:ascii="Arial" w:hAnsi="Arial"/>
-                <w:sz w:val="18"/>
+                <w:sz w:val="16"/>
               </w:rPr>
               <w:t>____________________________</w:t>
             </w:r>
@@ -131,7 +131,7 @@
             <w:r>
               <w:rPr>
                 <w:rFonts w:ascii="Arial" w:hAnsi="Arial"/>
-                <w:sz w:val="18"/>
+                <w:sz w:val="16"/>
               </w:rPr>
               <w:t>Group</w:t>
             </w:r>
@@ -149,7 +149,7 @@
             <w:r>
               <w:rPr>
                 <w:rFonts w:ascii="Arial" w:hAnsi="Arial"/>
-                <w:sz w:val="18"/>
+                <w:sz w:val="16"/>
               </w:rPr>
               <w:t>____________________________</w:t>
             </w:r>
@@ -169,7 +169,7 @@
             <w:r>
               <w:rPr>
                 <w:rFonts w:ascii="Arial" w:hAnsi="Arial"/>
-                <w:sz w:val="18"/>
+                <w:sz w:val="16"/>
               </w:rPr>
               <w:t>Year</w:t>
             </w:r>
@@ -187,7 +187,7 @@
             <w:r>
               <w:rPr>
                 <w:rFonts w:ascii="Arial" w:hAnsi="Arial"/>
-                <w:sz w:val="18"/>
+                <w:sz w:val="16"/>
               </w:rPr>
               <w:t>2026</w:t>
             </w:r>
@@ -304,7 +304,7 @@
             <w:r>
               <w:rPr>
                 <w:rFonts w:ascii="Arial" w:hAnsi="Arial"/>
-                <w:sz w:val="18"/>
+                <w:sz w:val="16"/>
               </w:rPr>
               <w:t>Product type</w:t>
             </w:r>
@@ -323,7 +323,7 @@
             <w:r>
               <w:rPr>
                 <w:rFonts w:ascii="Arial" w:hAnsi="Arial"/>
-                <w:sz w:val="18"/>
+                <w:sz w:val="16"/>
               </w:rPr>
               <w:t>Budget</w:t>
             </w:r>
@@ -342,7 +342,7 @@
             <w:r>
               <w:rPr>
                 <w:rFonts w:ascii="Arial" w:hAnsi="Arial"/>
-                <w:sz w:val="18"/>
+                <w:sz w:val="16"/>
               </w:rPr>
               <w:t>Premium</w:t>
             </w:r>
@@ -361,7 +361,7 @@
             <w:r>
               <w:rPr>
                 <w:rFonts w:ascii="Arial" w:hAnsi="Arial"/>
-                <w:sz w:val="18"/>
+                <w:sz w:val="16"/>
               </w:rPr>
               <w:t>Eco</w:t>
             </w:r>
@@ -380,7 +380,7 @@
             <w:r>
               <w:rPr>
                 <w:rFonts w:ascii="Arial" w:hAnsi="Arial"/>
-                <w:sz w:val="18"/>
+                <w:sz w:val="16"/>
               </w:rPr>
               <w:t>Industrial</w:t>
             </w:r>
@@ -400,7 +400,7 @@
             <w:r>
               <w:rPr>
                 <w:rFonts w:ascii="Arial" w:hAnsi="Arial"/>
-                <w:sz w:val="18"/>
+                <w:sz w:val="16"/>
               </w:rPr>
               <w:t>Light</w:t>
             </w:r>
@@ -418,7 +418,7 @@
             <w:r>
               <w:rPr>
                 <w:rFonts w:ascii="Arial" w:hAnsi="Arial"/>
-                <w:sz w:val="18"/>
+                <w:sz w:val="16"/>
               </w:rPr>
               <w:t>BudgetLight</w:t>
             </w:r>
@@ -436,7 +436,7 @@
             <w:r>
               <w:rPr>
                 <w:rFonts w:ascii="Arial" w:hAnsi="Arial"/>
-                <w:sz w:val="18"/>
+                <w:sz w:val="16"/>
               </w:rPr>
               <w:t>PremiumLight</w:t>
             </w:r>
@@ -454,7 +454,7 @@
             <w:r>
               <w:rPr>
                 <w:rFonts w:ascii="Arial" w:hAnsi="Arial"/>
-                <w:sz w:val="18"/>
+                <w:sz w:val="16"/>
               </w:rPr>
               <w:t>EcoLight</w:t>
             </w:r>
@@ -472,7 +472,7 @@
             <w:r>
               <w:rPr>
                 <w:rFonts w:ascii="Arial" w:hAnsi="Arial"/>
-                <w:sz w:val="18"/>
+                <w:sz w:val="16"/>
               </w:rPr>
               <w:t>IndustrialLight</w:t>
             </w:r>
@@ -492,7 +492,7 @@
             <w:r>
               <w:rPr>
                 <w:rFonts w:ascii="Arial" w:hAnsi="Arial"/>
-                <w:sz w:val="18"/>
+                <w:sz w:val="16"/>
               </w:rPr>
               <w:t>Thermostat</w:t>
             </w:r>
@@ -510,7 +510,7 @@
             <w:r>
               <w:rPr>
                 <w:rFonts w:ascii="Arial" w:hAnsi="Arial"/>
-                <w:sz w:val="18"/>
+                <w:sz w:val="16"/>
               </w:rPr>
               <w:t>BudgetThermostat</w:t>
             </w:r>
@@ -528,7 +528,7 @@
             <w:r>
               <w:rPr>
                 <w:rFonts w:ascii="Arial" w:hAnsi="Arial"/>
-                <w:sz w:val="18"/>
+                <w:sz w:val="16"/>
               </w:rPr>
               <w:t>PremiumThermostat</w:t>
             </w:r>
@@ -546,7 +546,7 @@
             <w:r>
               <w:rPr>
                 <w:rFonts w:ascii="Arial" w:hAnsi="Arial"/>
-                <w:sz w:val="18"/>
+                <w:sz w:val="16"/>
               </w:rPr>
               <w:t>EcoThermostat</w:t>
             </w:r>
@@ -564,7 +564,7 @@
             <w:r>
               <w:rPr>
                 <w:rFonts w:ascii="Arial" w:hAnsi="Arial"/>
-                <w:sz w:val="18"/>
+                <w:sz w:val="16"/>
               </w:rPr>
               <w:t>IndustrialThermostat</w:t>
             </w:r>
@@ -584,7 +584,7 @@
             <w:r>
               <w:rPr>
                 <w:rFonts w:ascii="Arial" w:hAnsi="Arial"/>
-                <w:sz w:val="18"/>
+                <w:sz w:val="16"/>
               </w:rPr>
               <w:t>Security</w:t>
             </w:r>
@@ -602,7 +602,7 @@
             <w:r>
               <w:rPr>
                 <w:rFonts w:ascii="Arial" w:hAnsi="Arial"/>
-                <w:sz w:val="18"/>
+                <w:sz w:val="16"/>
               </w:rPr>
               <w:t>BudgetSecuritySystem</w:t>
             </w:r>
@@ -620,7 +620,7 @@
             <w:r>
               <w:rPr>
                 <w:rFonts w:ascii="Arial" w:hAnsi="Arial"/>
-                <w:sz w:val="18"/>
+                <w:sz w:val="16"/>
               </w:rPr>
               <w:t>PremiumSecuritySystem</w:t>
             </w:r>
@@ -638,7 +638,7 @@
             <w:r>
               <w:rPr>
                 <w:rFonts w:ascii="Arial" w:hAnsi="Arial"/>
-                <w:sz w:val="18"/>
+                <w:sz w:val="16"/>
               </w:rPr>
               <w:t>EcoSecuritySystem</w:t>
             </w:r>
@@ -656,7 +656,7 @@
             <w:r>
               <w:rPr>
                 <w:rFonts w:ascii="Arial" w:hAnsi="Arial"/>
-                <w:sz w:val="18"/>
+                <w:sz w:val="16"/>
               </w:rPr>
               <w:t>IndustrialSecuritySystem</w:t>
             </w:r>
@@ -1401,98 +1401,66 @@
     </w:p>
     <w:p>
       <w:pPr>
-        <w:pStyle w:val="ListNumber"/>
+        <w:spacing w:after="120" w:line="259" w:lineRule="auto"/>
       </w:pPr>
       <w:r>
-        <w:t>3041039 Initial domain model without factories</w:t>
+        <w:t>1. Initial domain model without factories</w:t>
       </w:r>
     </w:p>
     <w:p>
       <w:pPr>
-        <w:pStyle w:val="ListNumber"/>
+        <w:spacing w:after="120" w:line="259" w:lineRule="auto"/>
       </w:pPr>
       <w:r>
-        <w:t>fadc3c2 Add product abstractions</w:t>
+        <w:t>2. Add product abstractions</w:t>
       </w:r>
     </w:p>
     <w:p>
       <w:pPr>
-        <w:pStyle w:val="ListNumber"/>
+        <w:spacing w:after="120" w:line="259" w:lineRule="auto"/>
       </w:pPr>
       <w:r>
-        <w:t>795fdc2 Introduce Factory Method</w:t>
+        <w:t>3. Introduce Factory Method</w:t>
       </w:r>
     </w:p>
     <w:p>
       <w:pPr>
-        <w:pStyle w:val="ListNumber"/>
+        <w:spacing w:after="120" w:line="259" w:lineRule="auto"/>
       </w:pPr>
       <w:r>
-        <w:t>47964c1 Add Budget Premium and Eco product families</w:t>
+        <w:t>4. Add Budget Premium and Eco product families</w:t>
       </w:r>
     </w:p>
     <w:p>
       <w:pPr>
-        <w:pStyle w:val="ListNumber"/>
+        <w:spacing w:after="120" w:line="259" w:lineRule="auto"/>
       </w:pPr>
       <w:r>
-        <w:t>9450a18 Introduce Abstract Factory and business controller</w:t>
+        <w:t>5. Introduce Abstract Factory and business controller</w:t>
       </w:r>
     </w:p>
     <w:p>
       <w:pPr>
-        <w:pStyle w:val="ListNumber"/>
+        <w:spacing w:after="120" w:line="259" w:lineRule="auto"/>
       </w:pPr>
       <w:r>
-        <w:t>6774e46 Add runtime factory selection and console app</w:t>
+        <w:t>6. Add runtime factory selection and console app</w:t>
       </w:r>
     </w:p>
     <w:p>
       <w:pPr>
-        <w:pStyle w:val="ListNumber"/>
+        <w:spacing w:after="120" w:line="259" w:lineRule="auto"/>
       </w:pPr>
       <w:r>
-        <w:t>713716d Add tests and compatibility rules</w:t>
+        <w:t>7. Add tests and compatibility rules</w:t>
       </w:r>
     </w:p>
     <w:p>
       <w:pPr>
-        <w:pStyle w:val="ListNumber"/>
+        <w:spacing w:after="120" w:line="259" w:lineRule="auto"/>
       </w:pPr>
       <w:r>
-        <w:t>c727dae Add fourth Industrial product family</w:t>
-      </w:r>
-    </w:p>
-    <w:p>
-      <w:pPr>
-        <w:pStyle w:val="ListNumber"/>
-      </w:pPr>
-      <w:r>
-        <w:t>e76adab Add documentation UML source and defense notes</w:t>
-      </w:r>
-    </w:p>
-    <w:p>
-      <w:pPr>
-        <w:pStyle w:val="ListNumber"/>
-      </w:pPr>
-      <w:r>
-        <w:t>df9ffcd Document development history</w:t>
-      </w:r>
-    </w:p>
-    <w:p>
-      <w:pPr>
-        <w:pStyle w:val="ListNumber"/>
-      </w:pPr>
-      <w:r>
-        <w:t>9e62514 Correct console output and controller line breaks</w:t>
-      </w:r>
-    </w:p>
-    <w:p>
-      <w:pPr>
-        <w:pStyle w:val="ListNumber"/>
-      </w:pPr>
-      <w:r>
-        <w:t>80541a9 Verify concrete product classes in factory tests</w:t>
+        <w:t>8. Add fourth Industrial product family</w:t>
       </w:r>
     </w:p>
     <w:p>

</xml_diff>

<commit_message>
Improve report table readability
</commit_message>
<xml_diff>
--- a/docs/Assignment2_Report.docx
+++ b/docs/Assignment2_Report.docx
@@ -93,7 +93,7 @@
             <w:r>
               <w:rPr>
                 <w:rFonts w:ascii="Arial" w:hAnsi="Arial"/>
-                <w:sz w:val="16"/>
+                <w:sz w:val="14"/>
               </w:rPr>
               <w:t>Student</w:t>
             </w:r>
@@ -111,7 +111,7 @@
             <w:r>
               <w:rPr>
                 <w:rFonts w:ascii="Arial" w:hAnsi="Arial"/>
-                <w:sz w:val="16"/>
+                <w:sz w:val="14"/>
               </w:rPr>
               <w:t>____________________________</w:t>
             </w:r>
@@ -131,7 +131,7 @@
             <w:r>
               <w:rPr>
                 <w:rFonts w:ascii="Arial" w:hAnsi="Arial"/>
-                <w:sz w:val="16"/>
+                <w:sz w:val="14"/>
               </w:rPr>
               <w:t>Group</w:t>
             </w:r>
@@ -149,7 +149,7 @@
             <w:r>
               <w:rPr>
                 <w:rFonts w:ascii="Arial" w:hAnsi="Arial"/>
-                <w:sz w:val="16"/>
+                <w:sz w:val="14"/>
               </w:rPr>
               <w:t>____________________________</w:t>
             </w:r>
@@ -169,7 +169,7 @@
             <w:r>
               <w:rPr>
                 <w:rFonts w:ascii="Arial" w:hAnsi="Arial"/>
-                <w:sz w:val="16"/>
+                <w:sz w:val="14"/>
               </w:rPr>
               <w:t>Year</w:t>
             </w:r>
@@ -187,7 +187,7 @@
             <w:r>
               <w:rPr>
                 <w:rFonts w:ascii="Arial" w:hAnsi="Arial"/>
-                <w:sz w:val="16"/>
+                <w:sz w:val="14"/>
               </w:rPr>
               <w:t>2026</w:t>
             </w:r>
@@ -304,7 +304,7 @@
             <w:r>
               <w:rPr>
                 <w:rFonts w:ascii="Arial" w:hAnsi="Arial"/>
-                <w:sz w:val="16"/>
+                <w:sz w:val="14"/>
               </w:rPr>
               <w:t>Product type</w:t>
             </w:r>
@@ -323,7 +323,7 @@
             <w:r>
               <w:rPr>
                 <w:rFonts w:ascii="Arial" w:hAnsi="Arial"/>
-                <w:sz w:val="16"/>
+                <w:sz w:val="14"/>
               </w:rPr>
               <w:t>Budget</w:t>
             </w:r>
@@ -342,7 +342,7 @@
             <w:r>
               <w:rPr>
                 <w:rFonts w:ascii="Arial" w:hAnsi="Arial"/>
-                <w:sz w:val="16"/>
+                <w:sz w:val="14"/>
               </w:rPr>
               <w:t>Premium</w:t>
             </w:r>
@@ -361,7 +361,7 @@
             <w:r>
               <w:rPr>
                 <w:rFonts w:ascii="Arial" w:hAnsi="Arial"/>
-                <w:sz w:val="16"/>
+                <w:sz w:val="14"/>
               </w:rPr>
               <w:t>Eco</w:t>
             </w:r>
@@ -380,7 +380,7 @@
             <w:r>
               <w:rPr>
                 <w:rFonts w:ascii="Arial" w:hAnsi="Arial"/>
-                <w:sz w:val="16"/>
+                <w:sz w:val="14"/>
               </w:rPr>
               <w:t>Industrial</w:t>
             </w:r>
@@ -400,7 +400,7 @@
             <w:r>
               <w:rPr>
                 <w:rFonts w:ascii="Arial" w:hAnsi="Arial"/>
-                <w:sz w:val="16"/>
+                <w:sz w:val="14"/>
               </w:rPr>
               <w:t>Light</w:t>
             </w:r>
@@ -418,7 +418,7 @@
             <w:r>
               <w:rPr>
                 <w:rFonts w:ascii="Arial" w:hAnsi="Arial"/>
-                <w:sz w:val="16"/>
+                <w:sz w:val="14"/>
               </w:rPr>
               <w:t>BudgetLight</w:t>
             </w:r>
@@ -436,7 +436,7 @@
             <w:r>
               <w:rPr>
                 <w:rFonts w:ascii="Arial" w:hAnsi="Arial"/>
-                <w:sz w:val="16"/>
+                <w:sz w:val="14"/>
               </w:rPr>
               <w:t>PremiumLight</w:t>
             </w:r>
@@ -454,7 +454,7 @@
             <w:r>
               <w:rPr>
                 <w:rFonts w:ascii="Arial" w:hAnsi="Arial"/>
-                <w:sz w:val="16"/>
+                <w:sz w:val="14"/>
               </w:rPr>
               <w:t>EcoLight</w:t>
             </w:r>
@@ -472,7 +472,7 @@
             <w:r>
               <w:rPr>
                 <w:rFonts w:ascii="Arial" w:hAnsi="Arial"/>
-                <w:sz w:val="16"/>
+                <w:sz w:val="14"/>
               </w:rPr>
               <w:t>IndustrialLight</w:t>
             </w:r>
@@ -492,7 +492,7 @@
             <w:r>
               <w:rPr>
                 <w:rFonts w:ascii="Arial" w:hAnsi="Arial"/>
-                <w:sz w:val="16"/>
+                <w:sz w:val="14"/>
               </w:rPr>
               <w:t>Thermostat</w:t>
             </w:r>
@@ -510,7 +510,7 @@
             <w:r>
               <w:rPr>
                 <w:rFonts w:ascii="Arial" w:hAnsi="Arial"/>
-                <w:sz w:val="16"/>
+                <w:sz w:val="14"/>
               </w:rPr>
               <w:t>BudgetThermostat</w:t>
             </w:r>
@@ -528,7 +528,7 @@
             <w:r>
               <w:rPr>
                 <w:rFonts w:ascii="Arial" w:hAnsi="Arial"/>
-                <w:sz w:val="16"/>
+                <w:sz w:val="14"/>
               </w:rPr>
               <w:t>PremiumThermostat</w:t>
             </w:r>
@@ -546,7 +546,7 @@
             <w:r>
               <w:rPr>
                 <w:rFonts w:ascii="Arial" w:hAnsi="Arial"/>
-                <w:sz w:val="16"/>
+                <w:sz w:val="14"/>
               </w:rPr>
               <w:t>EcoThermostat</w:t>
             </w:r>
@@ -564,7 +564,7 @@
             <w:r>
               <w:rPr>
                 <w:rFonts w:ascii="Arial" w:hAnsi="Arial"/>
-                <w:sz w:val="16"/>
+                <w:sz w:val="14"/>
               </w:rPr>
               <w:t>IndustrialThermostat</w:t>
             </w:r>
@@ -584,7 +584,7 @@
             <w:r>
               <w:rPr>
                 <w:rFonts w:ascii="Arial" w:hAnsi="Arial"/>
-                <w:sz w:val="16"/>
+                <w:sz w:val="14"/>
               </w:rPr>
               <w:t>Security</w:t>
             </w:r>
@@ -602,7 +602,7 @@
             <w:r>
               <w:rPr>
                 <w:rFonts w:ascii="Arial" w:hAnsi="Arial"/>
-                <w:sz w:val="16"/>
+                <w:sz w:val="14"/>
               </w:rPr>
               <w:t>BudgetSecuritySystem</w:t>
             </w:r>
@@ -620,7 +620,7 @@
             <w:r>
               <w:rPr>
                 <w:rFonts w:ascii="Arial" w:hAnsi="Arial"/>
-                <w:sz w:val="16"/>
+                <w:sz w:val="14"/>
               </w:rPr>
               <w:t>PremiumSecuritySystem</w:t>
             </w:r>
@@ -638,7 +638,7 @@
             <w:r>
               <w:rPr>
                 <w:rFonts w:ascii="Arial" w:hAnsi="Arial"/>
-                <w:sz w:val="16"/>
+                <w:sz w:val="14"/>
               </w:rPr>
               <w:t>EcoSecuritySystem</w:t>
             </w:r>
@@ -656,7 +656,7 @@
             <w:r>
               <w:rPr>
                 <w:rFonts w:ascii="Arial" w:hAnsi="Arial"/>
-                <w:sz w:val="16"/>
+                <w:sz w:val="14"/>
               </w:rPr>
               <w:t>IndustrialSecuritySystem</w:t>
             </w:r>

</xml_diff>